<commit_message>
test(docx): include a real WordprocessingML comment in the fixture
</commit_message>
<xml_diff>
--- a/03_Implement/test/fixtures/docx/sample.docx
+++ b/03_Implement/test/fixtures/docx/sample.docx
@@ -11,8 +11,16 @@
       </w:r>
     </w:p>
     <w:p>
+      <w:commentRangeStart w:id="0"/>
       <w:r>
         <w:t>本書はWord Source Adapterの実地fixtureです。</w:t>
+      </w:r>
+      <w:commentRangeEnd w:id="0"/>
+      <w:r>
+        <w:rPr>
+          <w:rStyle w:val="CommentReference"/>
+        </w:rPr>
+        <w:commentReference w:id="0"/>
       </w:r>
     </w:p>
     <w:p>
@@ -124,7 +132,7 @@
                     <pic:cNvPicPr/>
                   </pic:nvPicPr>
                   <pic:blipFill>
-                    <a:blip r:embed="rId9"/>
+                    <a:blip r:embed="rId10"/>
                     <a:stretch>
                       <a:fillRect/>
                     </a:stretch>
@@ -151,6 +159,27 @@
     </w:sectPr>
   </w:body>
 </w:document>
+</file>
+
+<file path=word/comments.xml><?xml version="1.0" encoding="utf-8"?>
+<w:comments xmlns:a="http://schemas.openxmlformats.org/drawingml/2006/main" xmlns:pic="http://schemas.openxmlformats.org/drawingml/2006/picture" xmlns:r="http://schemas.openxmlformats.org/officeDocument/2006/relationships" xmlns:w="http://schemas.openxmlformats.org/wordprocessingml/2006/main" xmlns:wp="http://schemas.openxmlformats.org/drawingml/2006/wordprocessingDrawing" xmlns:mc="http://schemas.openxmlformats.org/markup-compatibility/2006" xmlns:a14="http://schemas.microsoft.com/office/drawing/2010/main" xmlns:w14="http://schemas.microsoft.com/office/word/2010/wordml" xmlns:wpc="http://schemas.microsoft.com/office/word/2010/wordprocessingCanvas">
+  <w:comment w:id="0" w:author="レビュア" w:initials="RV" w:date="2026-10-20T14:21:27Z">
+    <w:p>
+      <w:pPr>
+        <w:pStyle w:val="CommentText"/>
+      </w:pPr>
+      <w:r>
+        <w:rPr>
+          <w:rStyle w:val="CommentReference"/>
+        </w:rPr>
+        <w:annotationRef/>
+      </w:r>
+      <w:r>
+        <w:t>実文書のコメント経路を確認する</w:t>
+      </w:r>
+    </w:p>
+  </w:comment>
+</w:comments>
 </file>
 
 <file path=word/numbering.xml><?xml version="1.0" encoding="utf-8"?>

</xml_diff>